<commit_message>
docs: document the Choose Save Location download dialog
https://claude.ai/code/session_01SBEQY7Nv7UCDvHA4Nf7ZHQ
</commit_message>
<xml_diff>
--- a/docs/Invoice-Download-Tool-Guide.docx
+++ b/docs/Invoice-Download-Tool-Guide.docx
@@ -1193,6 +1193,933 @@
       </w:r>
       <w:r>
         <w:t xml:space="preserve"> request per PDF.</w:t>
+      </w:r>
+    </w:p>
+    <w:p/>
+    <w:p/>
+    <w:p/>
+    <w:p>
+      <w:pPr>
+        <w:pStyle w:val="Heading1"/>
+      </w:pPr>
+      <w:r>
+        <w:t>The "Choose Save Location" dialog</w:t>
+      </w:r>
+    </w:p>
+    <w:p/>
+    <w:p>
+      <w:r>
+        <w:t>When you start a bulk download, the tool opens a three-step modal —</w:t>
+      </w:r>
+    </w:p>
+    <w:p>
+      <w:r>
+        <w:rPr>
+          <w:b/>
+        </w:rPr>
+        <w:t>Save Location → Downloading → Complete</w:t>
+      </w:r>
+      <w:r>
+        <w:t>. Step 1 is where you pick</w:t>
+      </w:r>
+    </w:p>
+    <w:p>
+      <w:r>
+        <w:t>the destination folder and tune how the batch runs.</w:t>
+      </w:r>
+    </w:p>
+    <w:p/>
+    <w:p>
+      <w:pPr>
+        <w:pStyle w:val="Heading2"/>
+      </w:pPr>
+      <w:r>
+        <w:t>Anatomy of the dialog</w:t>
+      </w:r>
+    </w:p>
+    <w:p/>
+    <w:p>
+      <w:r>
+        <w:rPr>
+          <w:b/>
+        </w:rPr>
+        <w:t>Selected for Download</w:t>
+      </w:r>
+      <w:r>
+        <w:t xml:space="preserve"> — read-only summary at the top.</w:t>
+      </w:r>
+    </w:p>
+    <w:p/>
+    <w:p>
+      <w:pPr>
+        <w:pStyle w:val="ListBullet"/>
+      </w:pPr>
+      <w:r>
+        <w:t xml:space="preserve">The first chip shows the count of PDFs queued (e.g. </w:t>
+      </w:r>
+      <w:r>
+        <w:rPr>
+          <w:rFonts w:ascii="Consolas" w:hAnsi="Consolas"/>
+          <w:sz w:val="20"/>
+        </w:rPr>
+        <w:t>16626 PDFs</w:t>
+      </w:r>
+      <w:r>
+        <w:t>).</w:t>
+      </w:r>
+    </w:p>
+    <w:p>
+      <w:pPr>
+        <w:pStyle w:val="ListBullet"/>
+      </w:pPr>
+      <w:r>
+        <w:t>The second chip shows an estimated total size in KB (e.g.</w:t>
+      </w:r>
+    </w:p>
+    <w:p>
+      <w:r>
+        <w:t xml:space="preserve">  </w:t>
+      </w:r>
+      <w:r>
+        <w:rPr>
+          <w:rFonts w:ascii="Consolas" w:hAnsi="Consolas"/>
+          <w:sz w:val="20"/>
+        </w:rPr>
+        <w:t>Est. ~ 1413210 KB</w:t>
+      </w:r>
+      <w:r>
+        <w:t>). This is an estimate based on average invoice</w:t>
+      </w:r>
+    </w:p>
+    <w:p>
+      <w:r>
+        <w:t xml:space="preserve">  size, not the exact figure.</w:t>
+      </w:r>
+    </w:p>
+    <w:p/>
+    <w:p>
+      <w:r>
+        <w:rPr>
+          <w:b/>
+        </w:rPr>
+        <w:t>Download Folder</w:t>
+      </w:r>
+      <w:r>
+        <w:t xml:space="preserve"> — where the PDFs will land on your machine.</w:t>
+      </w:r>
+    </w:p>
+    <w:p/>
+    <w:p>
+      <w:pPr>
+        <w:pStyle w:val="ListNumber"/>
+      </w:pPr>
+      <w:r>
+        <w:t xml:space="preserve">Click </w:t>
+      </w:r>
+      <w:r>
+        <w:rPr>
+          <w:b/>
+        </w:rPr>
+        <w:t>Browse…</w:t>
+      </w:r>
+      <w:r>
+        <w:t xml:space="preserve"> and pick a folder. The browser will ask for</w:t>
+      </w:r>
+    </w:p>
+    <w:p>
+      <w:r>
+        <w:t xml:space="preserve">   permission to write to that folder; grant it.</w:t>
+      </w:r>
+    </w:p>
+    <w:p>
+      <w:pPr>
+        <w:pStyle w:val="ListNumber"/>
+      </w:pPr>
+      <w:r>
+        <w:t>The selected path appears in the dropdown below the Browse button.</w:t>
+      </w:r>
+    </w:p>
+    <w:p>
+      <w:pPr>
+        <w:pStyle w:val="ListNumber"/>
+      </w:pPr>
+      <w:r>
+        <w:rPr>
+          <w:b/>
+        </w:rPr>
+        <w:t>Browser tip:</w:t>
+      </w:r>
+      <w:r>
+        <w:t xml:space="preserve"> Chromium-based browsers block direct writes to</w:t>
+      </w:r>
+    </w:p>
+    <w:p>
+      <w:r>
+        <w:t xml:space="preserve">   top-level folders such as </w:t>
+      </w:r>
+      <w:r>
+        <w:rPr>
+          <w:rFonts w:ascii="Consolas" w:hAnsi="Consolas"/>
+          <w:sz w:val="20"/>
+        </w:rPr>
+        <w:t>Downloads</w:t>
+      </w:r>
+      <w:r>
+        <w:t xml:space="preserve">, </w:t>
+      </w:r>
+      <w:r>
+        <w:rPr>
+          <w:rFonts w:ascii="Consolas" w:hAnsi="Consolas"/>
+          <w:sz w:val="20"/>
+        </w:rPr>
+        <w:t>Desktop</w:t>
+      </w:r>
+      <w:r>
+        <w:t xml:space="preserve">, or </w:t>
+      </w:r>
+      <w:r>
+        <w:rPr>
+          <w:rFonts w:ascii="Consolas" w:hAnsi="Consolas"/>
+          <w:sz w:val="20"/>
+        </w:rPr>
+        <w:t>Documents</w:t>
+      </w:r>
+      <w:r>
+        <w:t>.</w:t>
+      </w:r>
+    </w:p>
+    <w:p>
+      <w:r>
+        <w:t xml:space="preserve">   If your pick is rejected, either select a </w:t>
+      </w:r>
+      <w:r>
+        <w:rPr>
+          <w:b/>
+        </w:rPr>
+        <w:t>subfolder</w:t>
+      </w:r>
+      <w:r>
+        <w:t xml:space="preserve"> of one of</w:t>
+      </w:r>
+    </w:p>
+    <w:p>
+      <w:r>
+        <w:t xml:space="preserve">   those locations, or create a fresh folder (e.g. </w:t>
+      </w:r>
+      <w:r>
+        <w:rPr>
+          <w:rFonts w:ascii="Consolas" w:hAnsi="Consolas"/>
+          <w:sz w:val="20"/>
+        </w:rPr>
+        <w:t>Invoices-2026-04</w:t>
+      </w:r>
+      <w:r>
+        <w:t>)</w:t>
+      </w:r>
+    </w:p>
+    <w:p>
+      <w:r>
+        <w:t xml:space="preserve">   and pick that.</w:t>
+      </w:r>
+    </w:p>
+    <w:p/>
+    <w:p>
+      <w:r>
+        <w:t xml:space="preserve">The </w:t>
+      </w:r>
+      <w:r>
+        <w:rPr>
+          <w:b/>
+        </w:rPr>
+        <w:t>Start Download</w:t>
+      </w:r>
+      <w:r>
+        <w:t xml:space="preserve"> button stays disabled and the footer shows</w:t>
+      </w:r>
+    </w:p>
+    <w:p>
+      <w:r>
+        <w:rPr>
+          <w:i/>
+        </w:rPr>
+        <w:t>"Select a folder to continue"</w:t>
+      </w:r>
+      <w:r>
+        <w:t xml:space="preserve"> until a valid folder is chosen.</w:t>
+      </w:r>
+    </w:p>
+    <w:p/>
+    <w:p>
+      <w:r>
+        <w:rPr>
+          <w:b/>
+        </w:rPr>
+        <w:t>Download Settings</w:t>
+      </w:r>
+      <w:r>
+        <w:t xml:space="preserve"> — controls how each file is named and how many</w:t>
+      </w:r>
+    </w:p>
+    <w:p>
+      <w:r>
+        <w:t>run in parallel.</w:t>
+      </w:r>
+    </w:p>
+    <w:p/>
+    <w:tbl>
+      <w:tblPr>
+        <w:tblStyle w:val="LightGrid-Accent1"/>
+        <w:tblW w:type="auto" w:w="0"/>
+        <w:tblLook w:firstColumn="1" w:firstRow="1" w:lastColumn="0" w:lastRow="0" w:noHBand="0" w:noVBand="1" w:val="04A0"/>
+      </w:tblPr>
+      <w:tblGrid>
+        <w:gridCol w:w="4320"/>
+        <w:gridCol w:w="4320"/>
+      </w:tblGrid>
+      <w:tr>
+        <w:tc>
+          <w:tcPr>
+            <w:tcW w:type="dxa" w:w="4320"/>
+          </w:tcPr>
+          <w:p>
+            <w:r>
+              <w:rPr>
+                <w:b/>
+              </w:rPr>
+            </w:r>
+            <w:r>
+              <w:rPr>
+                <w:b/>
+              </w:rPr>
+              <w:t>Setting</w:t>
+            </w:r>
+          </w:p>
+        </w:tc>
+        <w:tc>
+          <w:tcPr>
+            <w:tcW w:type="dxa" w:w="4320"/>
+          </w:tcPr>
+          <w:p>
+            <w:r>
+              <w:rPr>
+                <w:b/>
+              </w:rPr>
+            </w:r>
+            <w:r>
+              <w:rPr>
+                <w:b/>
+              </w:rPr>
+              <w:t>What it does</w:t>
+            </w:r>
+          </w:p>
+        </w:tc>
+      </w:tr>
+      <w:tr>
+        <w:tc>
+          <w:tcPr>
+            <w:tcW w:type="dxa" w:w="4320"/>
+          </w:tcPr>
+          <w:p>
+            <w:r/>
+            <w:r>
+              <w:rPr>
+                <w:b/>
+              </w:rPr>
+              <w:t>Filename Pattern</w:t>
+            </w:r>
+          </w:p>
+        </w:tc>
+        <w:tc>
+          <w:tcPr>
+            <w:tcW w:type="dxa" w:w="4320"/>
+          </w:tcPr>
+          <w:p>
+            <w:r/>
+            <w:r>
+              <w:t xml:space="preserve">Token-based pattern for each saved file. Default </w:t>
+            </w:r>
+            <w:r>
+              <w:rPr>
+                <w:rFonts w:ascii="Consolas" w:hAnsi="Consolas"/>
+                <w:sz w:val="20"/>
+              </w:rPr>
+              <w:t>{TranID}.pdf</w:t>
+            </w:r>
+            <w:r>
+              <w:t xml:space="preserve"> (e.g. </w:t>
+            </w:r>
+            <w:r>
+              <w:rPr>
+                <w:rFonts w:ascii="Consolas" w:hAnsi="Consolas"/>
+                <w:sz w:val="20"/>
+              </w:rPr>
+              <w:t>INV-10482.pdf</w:t>
+            </w:r>
+            <w:r>
+              <w:t>). Pick from the dropdown.</w:t>
+            </w:r>
+          </w:p>
+        </w:tc>
+      </w:tr>
+      <w:tr>
+        <w:tc>
+          <w:tcPr>
+            <w:tcW w:type="dxa" w:w="4320"/>
+          </w:tcPr>
+          <w:p>
+            <w:r/>
+            <w:r>
+              <w:rPr>
+                <w:b/>
+              </w:rPr>
+              <w:t>Filename Prefix</w:t>
+            </w:r>
+          </w:p>
+        </w:tc>
+        <w:tc>
+          <w:tcPr>
+            <w:tcW w:type="dxa" w:w="4320"/>
+          </w:tcPr>
+          <w:p>
+            <w:r/>
+            <w:r>
+              <w:t xml:space="preserve">Optional string prepended to every filename — handy for grouping by client (e.g. </w:t>
+            </w:r>
+            <w:r>
+              <w:rPr>
+                <w:rFonts w:ascii="Consolas" w:hAnsi="Consolas"/>
+                <w:sz w:val="20"/>
+              </w:rPr>
+              <w:t>Acme_INV-10482.pdf</w:t>
+            </w:r>
+            <w:r>
+              <w:t>).</w:t>
+            </w:r>
+          </w:p>
+        </w:tc>
+      </w:tr>
+      <w:tr>
+        <w:tc>
+          <w:tcPr>
+            <w:tcW w:type="dxa" w:w="4320"/>
+          </w:tcPr>
+          <w:p>
+            <w:r/>
+            <w:r>
+              <w:rPr>
+                <w:b/>
+              </w:rPr>
+              <w:t>Download At a Time</w:t>
+            </w:r>
+          </w:p>
+        </w:tc>
+        <w:tc>
+          <w:tcPr>
+            <w:tcW w:type="dxa" w:w="4320"/>
+          </w:tcPr>
+          <w:p>
+            <w:r/>
+            <w:r>
+              <w:t xml:space="preserve">Slider, range 1–10 (default 5). Number of </w:t>
+            </w:r>
+            <w:r>
+              <w:rPr>
+                <w:rFonts w:ascii="Consolas" w:hAnsi="Consolas"/>
+                <w:sz w:val="20"/>
+              </w:rPr>
+              <w:t>getPDF</w:t>
+            </w:r>
+            <w:r>
+              <w:t xml:space="preserve"> requests in flight concurrently. Higher = faster but heavier on NetSuite governance and your network.</w:t>
+            </w:r>
+          </w:p>
+        </w:tc>
+      </w:tr>
+      <w:tr>
+        <w:tc>
+          <w:tcPr>
+            <w:tcW w:type="dxa" w:w="4320"/>
+          </w:tcPr>
+          <w:p>
+            <w:r/>
+            <w:r>
+              <w:rPr>
+                <w:b/>
+              </w:rPr>
+              <w:t>Preview</w:t>
+            </w:r>
+          </w:p>
+        </w:tc>
+        <w:tc>
+          <w:tcPr>
+            <w:tcW w:type="dxa" w:w="4320"/>
+          </w:tcPr>
+          <w:p>
+            <w:r/>
+            <w:r>
+              <w:t>Live sample of the resulting filename based on the pattern + prefix you picked.</w:t>
+            </w:r>
+          </w:p>
+        </w:tc>
+      </w:tr>
+    </w:tbl>
+    <w:p/>
+    <w:p>
+      <w:r>
+        <w:rPr>
+          <w:b/>
+        </w:rPr>
+        <w:t>Options</w:t>
+      </w:r>
+      <w:r>
+        <w:t xml:space="preserve"> — toggles for batch behaviour.</w:t>
+      </w:r>
+    </w:p>
+    <w:p/>
+    <w:p>
+      <w:pPr>
+        <w:pStyle w:val="ListBullet"/>
+      </w:pPr>
+      <w:r>
+        <w:rPr>
+          <w:b/>
+        </w:rPr>
+        <w:t>Skip failed PDFs</w:t>
+      </w:r>
+      <w:r>
+        <w:t xml:space="preserve"> </w:t>
+      </w:r>
+      <w:r>
+        <w:rPr>
+          <w:i/>
+        </w:rPr>
+        <w:t>(on by default)</w:t>
+      </w:r>
+      <w:r>
+        <w:t xml:space="preserve"> — if a single transaction errors</w:t>
+      </w:r>
+    </w:p>
+    <w:p>
+      <w:r>
+        <w:t xml:space="preserve">  out (permission, render failure, voided record, etc.) the run keeps</w:t>
+      </w:r>
+    </w:p>
+    <w:p>
+      <w:r>
+        <w:t xml:space="preserve">  going and the failure is reported at the end. Turn it off to stop the</w:t>
+      </w:r>
+    </w:p>
+    <w:p>
+      <w:r>
+        <w:t xml:space="preserve">  whole batch on the first error.</w:t>
+      </w:r>
+    </w:p>
+    <w:p>
+      <w:pPr>
+        <w:pStyle w:val="ListBullet"/>
+      </w:pPr>
+      <w:r>
+        <w:rPr>
+          <w:b/>
+        </w:rPr>
+        <w:t>Create date subfolder</w:t>
+      </w:r>
+      <w:r>
+        <w:t xml:space="preserve"> </w:t>
+      </w:r>
+      <w:r>
+        <w:rPr>
+          <w:i/>
+        </w:rPr>
+        <w:t>(on by default)</w:t>
+      </w:r>
+      <w:r>
+        <w:t xml:space="preserve"> — saves files into a</w:t>
+      </w:r>
+    </w:p>
+    <w:p>
+      <w:r>
+        <w:t xml:space="preserve">  </w:t>
+      </w:r>
+      <w:r>
+        <w:rPr>
+          <w:rFonts w:ascii="Consolas" w:hAnsi="Consolas"/>
+          <w:sz w:val="20"/>
+        </w:rPr>
+        <w:t>YYYY-MM-DD</w:t>
+      </w:r>
+      <w:r>
+        <w:t xml:space="preserve"> subfolder of the chosen download folder, so repeated runs</w:t>
+      </w:r>
+    </w:p>
+    <w:p>
+      <w:r>
+        <w:t xml:space="preserve">  don't overwrite each other.</w:t>
+      </w:r>
+    </w:p>
+    <w:p/>
+    <w:p>
+      <w:pPr>
+        <w:pStyle w:val="Heading2"/>
+      </w:pPr>
+      <w:r>
+        <w:t>Step-by-step</w:t>
+      </w:r>
+    </w:p>
+    <w:p/>
+    <w:p>
+      <w:pPr>
+        <w:pStyle w:val="ListNumber"/>
+      </w:pPr>
+      <w:r>
+        <w:t>Run a search on the main page so the result set is what you actually</w:t>
+      </w:r>
+    </w:p>
+    <w:p>
+      <w:r>
+        <w:t xml:space="preserve">   want to download — the count shown in the modal is the count that</w:t>
+      </w:r>
+    </w:p>
+    <w:p>
+      <w:r>
+        <w:t xml:space="preserve">   will be downloaded.</w:t>
+      </w:r>
+    </w:p>
+    <w:p>
+      <w:pPr>
+        <w:pStyle w:val="ListNumber"/>
+      </w:pPr>
+      <w:r>
+        <w:t>Click the bulk-download action; the modal opens on **step 1 — Save</w:t>
+      </w:r>
+    </w:p>
+    <w:p>
+      <w:r>
+        <w:t xml:space="preserve">   Location**.</w:t>
+      </w:r>
+    </w:p>
+    <w:p>
+      <w:pPr>
+        <w:pStyle w:val="ListNumber"/>
+      </w:pPr>
+      <w:r>
+        <w:t xml:space="preserve">Click </w:t>
+      </w:r>
+      <w:r>
+        <w:rPr>
+          <w:b/>
+        </w:rPr>
+        <w:t>Browse…</w:t>
+      </w:r>
+      <w:r>
+        <w:t xml:space="preserve"> and pick (or create) a destination folder. If the</w:t>
+      </w:r>
+    </w:p>
+    <w:p>
+      <w:r>
+        <w:t xml:space="preserve">   browser rejects it, pick a subfolder instead.</w:t>
+      </w:r>
+    </w:p>
+    <w:p>
+      <w:pPr>
+        <w:pStyle w:val="ListNumber"/>
+      </w:pPr>
+      <w:r>
+        <w:t xml:space="preserve">Adjust the </w:t>
+      </w:r>
+      <w:r>
+        <w:rPr>
+          <w:b/>
+        </w:rPr>
+        <w:t>Filename Pattern</w:t>
+      </w:r>
+      <w:r>
+        <w:t xml:space="preserve"> and optional </w:t>
+      </w:r>
+      <w:r>
+        <w:rPr>
+          <w:b/>
+        </w:rPr>
+        <w:t>Filename Prefix</w:t>
+      </w:r>
+      <w:r>
+        <w:t xml:space="preserve"> until</w:t>
+      </w:r>
+    </w:p>
+    <w:p>
+      <w:r>
+        <w:t xml:space="preserve">   the </w:t>
+      </w:r>
+      <w:r>
+        <w:rPr>
+          <w:i/>
+        </w:rPr>
+        <w:t>Preview</w:t>
+      </w:r>
+      <w:r>
+        <w:t xml:space="preserve"> line matches what you want.</w:t>
+      </w:r>
+    </w:p>
+    <w:p>
+      <w:pPr>
+        <w:pStyle w:val="ListNumber"/>
+      </w:pPr>
+      <w:r>
+        <w:t xml:space="preserve">Drag the </w:t>
+      </w:r>
+      <w:r>
+        <w:rPr>
+          <w:b/>
+        </w:rPr>
+        <w:t>Download At a Time</w:t>
+      </w:r>
+      <w:r>
+        <w:t xml:space="preserve"> slider — start at 5, drop to 2–3 if</w:t>
+      </w:r>
+    </w:p>
+    <w:p>
+      <w:r>
+        <w:t xml:space="preserve">   you see governance errors or rate-limit messages, raise toward 10</w:t>
+      </w:r>
+    </w:p>
+    <w:p>
+      <w:r>
+        <w:t xml:space="preserve">   only on a fast connection with light NetSuite load.</w:t>
+      </w:r>
+    </w:p>
+    <w:p>
+      <w:pPr>
+        <w:pStyle w:val="ListNumber"/>
+      </w:pPr>
+      <w:r>
+        <w:t xml:space="preserve">Leave </w:t>
+      </w:r>
+      <w:r>
+        <w:rPr>
+          <w:b/>
+        </w:rPr>
+        <w:t>Skip failed PDFs</w:t>
+      </w:r>
+      <w:r>
+        <w:t xml:space="preserve"> on for unattended runs; turn it off if you</w:t>
+      </w:r>
+    </w:p>
+    <w:p>
+      <w:r>
+        <w:t xml:space="preserve">   want the run to halt the moment something fails so you can</w:t>
+      </w:r>
+    </w:p>
+    <w:p>
+      <w:r>
+        <w:t xml:space="preserve">   investigate.</w:t>
+      </w:r>
+    </w:p>
+    <w:p>
+      <w:pPr>
+        <w:pStyle w:val="ListNumber"/>
+      </w:pPr>
+      <w:r>
+        <w:t xml:space="preserve">Leave </w:t>
+      </w:r>
+      <w:r>
+        <w:rPr>
+          <w:b/>
+        </w:rPr>
+        <w:t>Create date subfolder</w:t>
+      </w:r>
+      <w:r>
+        <w:t xml:space="preserve"> on if you'll re-run the export — it</w:t>
+      </w:r>
+    </w:p>
+    <w:p>
+      <w:r>
+        <w:t xml:space="preserve">   keeps each run's output separated and avoids collisions.</w:t>
+      </w:r>
+    </w:p>
+    <w:p>
+      <w:pPr>
+        <w:pStyle w:val="ListNumber"/>
+      </w:pPr>
+      <w:r>
+        <w:t xml:space="preserve">Click </w:t>
+      </w:r>
+      <w:r>
+        <w:rPr>
+          <w:b/>
+        </w:rPr>
+        <w:t>Start Download →</w:t>
+      </w:r>
+      <w:r>
+        <w:t>. The dialog advances to **step 2 —</w:t>
+      </w:r>
+    </w:p>
+    <w:p>
+      <w:r>
+        <w:t xml:space="preserve">   Downloading</w:t>
+      </w:r>
+      <w:r>
+        <w:rPr>
+          <w:b/>
+        </w:rPr>
+        <w:t xml:space="preserve"> with a live progress count, and finally </w:t>
+      </w:r>
+      <w:r>
+        <w:t>step 3 —</w:t>
+      </w:r>
+    </w:p>
+    <w:p>
+      <w:r>
+        <w:t xml:space="preserve">   Complete** with a summary of successes, failures, and the destination</w:t>
+      </w:r>
+    </w:p>
+    <w:p>
+      <w:r>
+        <w:t xml:space="preserve">   path. </w:t>
+      </w:r>
+      <w:r>
+        <w:rPr>
+          <w:b/>
+        </w:rPr>
+        <w:t>Cancel</w:t>
+      </w:r>
+      <w:r>
+        <w:t xml:space="preserve"> aborts at any time.</w:t>
+      </w:r>
+    </w:p>
+    <w:p/>
+    <w:p>
+      <w:pPr>
+        <w:pStyle w:val="Heading2"/>
+      </w:pPr>
+      <w:r>
+        <w:t>Common pitfalls</w:t>
+      </w:r>
+    </w:p>
+    <w:p/>
+    <w:p>
+      <w:pPr>
+        <w:pStyle w:val="ListBullet"/>
+      </w:pPr>
+      <w:r>
+        <w:rPr>
+          <w:i/>
+        </w:rPr>
+        <w:t>"Select a folder to continue"</w:t>
+      </w:r>
+      <w:r>
+        <w:t xml:space="preserve"> never goes away → your browser blocked</w:t>
+      </w:r>
+    </w:p>
+    <w:p>
+      <w:r>
+        <w:t xml:space="preserve">  the folder pick. Choose a subfolder instead of </w:t>
+      </w:r>
+      <w:r>
+        <w:rPr>
+          <w:rFonts w:ascii="Consolas" w:hAnsi="Consolas"/>
+          <w:sz w:val="20"/>
+        </w:rPr>
+        <w:t>Downloads</w:t>
+      </w:r>
+      <w:r>
+        <w:t xml:space="preserve"> /</w:t>
+      </w:r>
+    </w:p>
+    <w:p>
+      <w:r>
+        <w:t xml:space="preserve">  </w:t>
+      </w:r>
+      <w:r>
+        <w:rPr>
+          <w:rFonts w:ascii="Consolas" w:hAnsi="Consolas"/>
+          <w:sz w:val="20"/>
+        </w:rPr>
+        <w:t>Documents</w:t>
+      </w:r>
+      <w:r>
+        <w:t xml:space="preserve"> / </w:t>
+      </w:r>
+      <w:r>
+        <w:rPr>
+          <w:rFonts w:ascii="Consolas" w:hAnsi="Consolas"/>
+          <w:sz w:val="20"/>
+        </w:rPr>
+        <w:t>Desktop</w:t>
+      </w:r>
+      <w:r>
+        <w:t>.</w:t>
+      </w:r>
+    </w:p>
+    <w:p>
+      <w:pPr>
+        <w:pStyle w:val="ListBullet"/>
+      </w:pPr>
+      <w:r>
+        <w:t>Files appear in the wrong folder → check whether **Create date</w:t>
+      </w:r>
+    </w:p>
+    <w:p>
+      <w:r>
+        <w:t xml:space="preserve">  subfolder** is enabled; PDFs land in </w:t>
+      </w:r>
+      <w:r>
+        <w:rPr>
+          <w:rFonts w:ascii="Consolas" w:hAnsi="Consolas"/>
+          <w:sz w:val="20"/>
+        </w:rPr>
+        <w:t>&lt;chosen-folder&gt;/YYYY-MM-DD/</w:t>
+      </w:r>
+      <w:r>
+        <w:t>.</w:t>
+      </w:r>
+    </w:p>
+    <w:p>
+      <w:pPr>
+        <w:pStyle w:val="ListBullet"/>
+      </w:pPr>
+      <w:r>
+        <w:t xml:space="preserve">Slow / stalled batches → lower </w:t>
+      </w:r>
+      <w:r>
+        <w:rPr>
+          <w:b/>
+        </w:rPr>
+        <w:t>Download At a Time</w:t>
+      </w:r>
+      <w:r>
+        <w:t>; each PDF is a</w:t>
+      </w:r>
+    </w:p>
+    <w:p>
+      <w:r>
+        <w:t xml:space="preserve">  separate Suitelet execution, and 10 in parallel can saturate slower</w:t>
+      </w:r>
+    </w:p>
+    <w:p>
+      <w:r>
+        <w:t xml:space="preserve">  links.</w:t>
+      </w:r>
+    </w:p>
+    <w:p>
+      <w:pPr>
+        <w:pStyle w:val="ListBullet"/>
+      </w:pPr>
+      <w:r>
+        <w:t xml:space="preserve">Filename collisions → add a </w:t>
+      </w:r>
+      <w:r>
+        <w:rPr>
+          <w:b/>
+        </w:rPr>
+        <w:t>Filename Prefix</w:t>
+      </w:r>
+      <w:r>
+        <w:t xml:space="preserve"> or switch the pattern</w:t>
+      </w:r>
+    </w:p>
+    <w:p>
+      <w:r>
+        <w:t xml:space="preserve">  to one that includes the customer or date token.</w:t>
       </w:r>
     </w:p>
     <w:p/>

</xml_diff>